<commit_message>
Mejora de Performance y arreglo de Q
</commit_message>
<xml_diff>
--- a/Auditoria_RF09_Precios_Hacienda.docx
+++ b/Auditoria_RF09_Precios_Hacienda.docx
@@ -1,6 +1,6 @@
 
 <file path=word/document.xml><?xml version="1.0" encoding="utf-8"?>
-<w:document xmlns:wpc="http://schemas.microsoft.com/office/word/2010/wordprocessingCanvas" xmlns:cx="http://schemas.microsoft.com/office/drawing/2014/chartex" xmlns:cx1="http://schemas.microsoft.com/office/drawing/2015/9/8/chartex" xmlns:cx2="http://schemas.microsoft.com/office/drawing/2015/10/21/chartex" xmlns:cx3="http://schemas.microsoft.com/office/drawing/2016/5/9/chartex" xmlns:cx4="http://schemas.microsoft.com/office/drawing/2016/5/10/chartex" xmlns:cx5="http://schemas.microsoft.com/office/drawing/2016/5/11/chartex" xmlns:cx6="http://schemas.microsoft.com/office/drawing/2016/5/12/chartex" xmlns:cx7="http://schemas.microsoft.com/office/drawing/2016/5/13/chartex" xmlns:cx8="http://schemas.microsoft.com/office/drawing/2016/5/14/chartex" xmlns:mc="http://schemas.openxmlformats.org/markup-compatibility/2006" xmlns:aink="http://schemas.microsoft.com/office/drawing/2016/ink" xmlns:am3d="http://schemas.microsoft.com/office/drawing/2017/model3d" xmlns:o="urn:schemas-microsoft-com:office:office" xmlns:oel="http://schemas.microsoft.com/office/2019/extlst" xmlns:r="http://schemas.openxmlformats.org/officeDocument/2006/relationships" xmlns:m="http://schemas.openxmlformats.org/officeDocument/2006/math" xmlns:v="urn:schemas-microsoft-com:vml" xmlns:wp14="http://schemas.microsoft.com/office/word/2010/wordprocessingDrawing" xmlns:wp="http://schemas.openxmlformats.org/drawingml/2006/wordprocessingDrawing" xmlns:w10="urn:schemas-microsoft-com:office:word" xmlns:w="http://schemas.openxmlformats.org/wordprocessingml/2006/main" xmlns:w14="http://schemas.microsoft.com/office/word/2010/wordml" xmlns:w15="http://schemas.microsoft.com/office/word/2012/wordml" xmlns:w16cex="http://schemas.microsoft.com/office/word/2018/wordml/cex" xmlns:w16cid="http://schemas.microsoft.com/office/word/2016/wordml/cid" xmlns:w16="http://schemas.microsoft.com/office/word/2018/wordml" xmlns:w16du="http://schemas.microsoft.com/office/word/2023/wordml/word16du" xmlns:w16sdtdh="http://schemas.microsoft.com/office/word/2020/wordml/sdtdatahash" xmlns:w16sdtfl="http://schemas.microsoft.com/office/word/2024/wordml/sdtformatlock" xmlns:w16se="http://schemas.microsoft.com/office/word/2015/wordml/symex" xmlns:wpg="http://schemas.microsoft.com/office/word/2010/wordprocessingGroup" xmlns:wpi="http://schemas.microsoft.com/office/word/2010/wordprocessingInk" xmlns:wne="http://schemas.microsoft.com/office/word/2006/wordml" xmlns:wps="http://schemas.microsoft.com/office/word/2010/wordprocessingShape" mc:Ignorable="w14 w15 w16se w16cid w16 w16cex w16sdtdh w16sdtfl w16du wp14">
+<w:document xmlns:wpc="http://schemas.microsoft.com/office/word/2010/wordprocessingCanvas" xmlns:cx="http://schemas.microsoft.com/office/drawing/2014/chartex" xmlns:cx1="http://schemas.microsoft.com/office/drawing/2015/9/8/chartex" xmlns:cx2="http://schemas.microsoft.com/office/drawing/2015/10/21/chartex" xmlns:cx3="http://schemas.microsoft.com/office/drawing/2016/5/9/chartex" xmlns:cx4="http://schemas.microsoft.com/office/drawing/2016/5/10/chartex" xmlns:cx5="http://schemas.microsoft.com/office/drawing/2016/5/11/chartex" xmlns:cx6="http://schemas.microsoft.com/office/drawing/2016/5/12/chartex" xmlns:cx7="http://schemas.microsoft.com/office/drawing/2016/5/13/chartex" xmlns:cx8="http://schemas.microsoft.com/office/drawing/2016/5/14/chartex" xmlns:mc="http://schemas.openxmlformats.org/markup-compatibility/2006" xmlns:aink="http://schemas.microsoft.com/office/drawing/2016/ink" xmlns:am3d="http://schemas.microsoft.com/office/drawing/2017/model3d" xmlns:o="urn:schemas-microsoft-com:office:office" xmlns:oel="http://schemas.microsoft.com/office/2019/extlst" xmlns:r="http://schemas.openxmlformats.org/officeDocument/2006/relationships" xmlns:m="http://schemas.openxmlformats.org/officeDocument/2006/math" xmlns:v="urn:schemas-microsoft-com:vml" xmlns:wp14="http://schemas.microsoft.com/office/word/2010/wordprocessingDrawing" xmlns:wp="http://schemas.openxmlformats.org/drawingml/2006/wordprocessingDrawing" xmlns:w10="urn:schemas-microsoft-com:office:word" xmlns:w="http://schemas.openxmlformats.org/wordprocessingml/2006/main" xmlns:w14="http://schemas.microsoft.com/office/word/2010/wordml" xmlns:w15="http://schemas.microsoft.com/office/word/2012/wordml" xmlns:w16cei="http://schemas.microsoft.com/office/word/2026/wordml/cei" xmlns:w16cex="http://schemas.microsoft.com/office/word/2018/wordml/cex" xmlns:w16cid="http://schemas.microsoft.com/office/word/2016/wordml/cid" xmlns:w16="http://schemas.microsoft.com/office/word/2018/wordml" xmlns:w16du="http://schemas.microsoft.com/office/word/2023/wordml/word16du" xmlns:w16sdtdh="http://schemas.microsoft.com/office/word/2020/wordml/sdtdatahash" xmlns:w16sdtfl="http://schemas.microsoft.com/office/word/2024/wordml/sdtformatlock" xmlns:w16se="http://schemas.microsoft.com/office/word/2015/wordml/symex" xmlns:wpg="http://schemas.microsoft.com/office/word/2010/wordprocessingGroup" xmlns:wpi="http://schemas.microsoft.com/office/word/2010/wordprocessingInk" xmlns:wne="http://schemas.microsoft.com/office/word/2006/wordml" xmlns:wps="http://schemas.microsoft.com/office/word/2010/wordprocessingShape" mc:Ignorable="w14 w15 w16se w16cid w16 w16cex w16sdtdh w16sdtfl w16du wp14">
   <w:body>
     <w:p>
       <w:pPr>
@@ -47,7 +47,13 @@
         <w:spacing w:after="120"/>
       </w:pPr>
       <w:r>
-        <w:t>Auditor: Claude (Auditor Funcional Senior - Power BI)</w:t>
+        <w:t xml:space="preserve">Auditor: </w:t>
+      </w:r>
+      <w:r>
+        <w:t>Dario Sidi</w:t>
+      </w:r>
+      <w:r>
+        <w:t xml:space="preserve"> (Auditor Funcional Senior - Power BI)</w:t>
       </w:r>
     </w:p>
     <w:p>
@@ -55,7 +61,7 @@
         <w:spacing w:after="120"/>
       </w:pPr>
       <w:r>
-        <w:t>Fuente de evidencia: Conexión en vivo a la instancia activa "Precios Hacienda" (Power BI Desktop, vía MCP/TOM)</w:t>
+        <w:t>Fuente de evidencia: Conexión en vivo a la instancia activa "Precios Hacienda" (Power BI Desktop)</w:t>
       </w:r>
     </w:p>
     <w:p>
@@ -84,7 +90,7 @@
         <w:spacing w:after="120"/>
       </w:pPr>
       <w:r>
-        <w:t>El modelo semántico de Power BI implementa con alta fidelidad los 24 indicadores exigidos por el RF09 (5 Gancho, 14 Pie, 5 Pie en Dólares), con mapeo de fuentes (CCDH / MDO Agroganadero) fiel al Anexo A, y variaciones mensual/trimestral/anual/quincenal cubiertas por un Motor Genérico parametrizado por Productos[NombreProducto] + Productos[Tipo]. Durante la auditoría se detectaron y corrigieron en vivo dos hallazgos: (1) una medida legacy duplicada ("Novillito 391/430 Pesos Gancho") sin impacto numérico, eliminada tras validar equivalencia exacta con el Motor Genérico; y (2) un gap real de cálculo en Consumo Liviano, que no aplicaba el coeficiente 0,57 exigido por el documento, sobrestimando el precio en ~75% en todos los períodos con datos. Tras la corrección, la verificación exhaustiva de los 24 indicadores contra el texto del documento arroja 100% de coincidencia en coeficientes y operaciones.</w:t>
+        <w:t>El modelo semántico de Power BI implementa con alta fidelidad los 24 indicadores exigidos por el RF09 (5 Gancho, 14 Pie, 5 Pie en Dólares), con mapeo de fuentes (CCDH / MDO Agroganadero) fiel al Anexo A, y variaciones mensual/trimestral/anual/quincenal cubiertas por un Motor Genérico parametrizado por Productos + Productos[Tipo]. Durante la auditoría se detectaron y corrigieron en vivo dos hallazgos: (1) una medida legacy duplicada ("Novillito 391/430 Pesos Gancho") sin impacto numérico, eliminada tras validar equivalencia exacta con el Motor Genérico; y (2) un gap real de cálculo en Consumo Liviano, que no aplicaba el coeficiente 0,57 exigido por el documento, sobrestimando el precio en ~75% en todos los períodos con datos. Tras la corrección, la verificación exhaustiva de los 24 indicadores contra el texto del documento arroja 100% de coincidencia en coeficientes y operaciones.</w:t>
       </w:r>
     </w:p>
     <w:p>
@@ -155,12 +161,6 @@
         <w:gridCol w:w="2700"/>
       </w:tblGrid>
       <w:tr>
-        <w:tblPrEx>
-          <w:tblCellMar>
-            <w:top w:w="0" w:type="dxa"/>
-            <w:bottom w:w="0" w:type="dxa"/>
-          </w:tblCellMar>
-        </w:tblPrEx>
         <w:trPr>
           <w:tblHeader/>
         </w:trPr>
@@ -262,12 +262,6 @@
         </w:tc>
       </w:tr>
       <w:tr>
-        <w:tblPrEx>
-          <w:tblCellMar>
-            <w:top w:w="0" w:type="dxa"/>
-            <w:bottom w:w="0" w:type="dxa"/>
-          </w:tblCellMar>
-        </w:tblPrEx>
         <w:tc>
           <w:tcPr>
             <w:tcW w:w="2600" w:type="dxa"/>
@@ -357,12 +351,6 @@
         </w:tc>
       </w:tr>
       <w:tr>
-        <w:tblPrEx>
-          <w:tblCellMar>
-            <w:top w:w="0" w:type="dxa"/>
-            <w:bottom w:w="0" w:type="dxa"/>
-          </w:tblCellMar>
-        </w:tblPrEx>
         <w:tc>
           <w:tcPr>
             <w:tcW w:w="2600" w:type="dxa"/>
@@ -452,12 +440,6 @@
         </w:tc>
       </w:tr>
       <w:tr>
-        <w:tblPrEx>
-          <w:tblCellMar>
-            <w:top w:w="0" w:type="dxa"/>
-            <w:bottom w:w="0" w:type="dxa"/>
-          </w:tblCellMar>
-        </w:tblPrEx>
         <w:tc>
           <w:tcPr>
             <w:tcW w:w="2600" w:type="dxa"/>
@@ -547,12 +529,6 @@
         </w:tc>
       </w:tr>
       <w:tr>
-        <w:tblPrEx>
-          <w:tblCellMar>
-            <w:top w:w="0" w:type="dxa"/>
-            <w:bottom w:w="0" w:type="dxa"/>
-          </w:tblCellMar>
-        </w:tblPrEx>
         <w:tc>
           <w:tcPr>
             <w:tcW w:w="2600" w:type="dxa"/>
@@ -642,12 +618,6 @@
         </w:tc>
       </w:tr>
       <w:tr>
-        <w:tblPrEx>
-          <w:tblCellMar>
-            <w:top w:w="0" w:type="dxa"/>
-            <w:bottom w:w="0" w:type="dxa"/>
-          </w:tblCellMar>
-        </w:tblPrEx>
         <w:tc>
           <w:tcPr>
             <w:tcW w:w="2600" w:type="dxa"/>
@@ -737,12 +707,6 @@
         </w:tc>
       </w:tr>
       <w:tr>
-        <w:tblPrEx>
-          <w:tblCellMar>
-            <w:top w:w="0" w:type="dxa"/>
-            <w:bottom w:w="0" w:type="dxa"/>
-          </w:tblCellMar>
-        </w:tblPrEx>
         <w:tc>
           <w:tcPr>
             <w:tcW w:w="2600" w:type="dxa"/>
@@ -832,12 +796,6 @@
         </w:tc>
       </w:tr>
       <w:tr>
-        <w:tblPrEx>
-          <w:tblCellMar>
-            <w:top w:w="0" w:type="dxa"/>
-            <w:bottom w:w="0" w:type="dxa"/>
-          </w:tblCellMar>
-        </w:tblPrEx>
         <w:tc>
           <w:tcPr>
             <w:tcW w:w="2600" w:type="dxa"/>
@@ -927,12 +885,6 @@
         </w:tc>
       </w:tr>
       <w:tr>
-        <w:tblPrEx>
-          <w:tblCellMar>
-            <w:top w:w="0" w:type="dxa"/>
-            <w:bottom w:w="0" w:type="dxa"/>
-          </w:tblCellMar>
-        </w:tblPrEx>
         <w:tc>
           <w:tcPr>
             <w:tcW w:w="2600" w:type="dxa"/>
@@ -1023,12 +975,6 @@
         </w:tc>
       </w:tr>
       <w:tr>
-        <w:tblPrEx>
-          <w:tblCellMar>
-            <w:top w:w="0" w:type="dxa"/>
-            <w:bottom w:w="0" w:type="dxa"/>
-          </w:tblCellMar>
-        </w:tblPrEx>
         <w:tc>
           <w:tcPr>
             <w:tcW w:w="2600" w:type="dxa"/>
@@ -1118,12 +1064,6 @@
         </w:tc>
       </w:tr>
       <w:tr>
-        <w:tblPrEx>
-          <w:tblCellMar>
-            <w:top w:w="0" w:type="dxa"/>
-            <w:bottom w:w="0" w:type="dxa"/>
-          </w:tblCellMar>
-        </w:tblPrEx>
         <w:tc>
           <w:tcPr>
             <w:tcW w:w="2600" w:type="dxa"/>
@@ -1213,12 +1153,6 @@
         </w:tc>
       </w:tr>
       <w:tr>
-        <w:tblPrEx>
-          <w:tblCellMar>
-            <w:top w:w="0" w:type="dxa"/>
-            <w:bottom w:w="0" w:type="dxa"/>
-          </w:tblCellMar>
-        </w:tblPrEx>
         <w:tc>
           <w:tcPr>
             <w:tcW w:w="2600" w:type="dxa"/>
@@ -1308,12 +1242,6 @@
         </w:tc>
       </w:tr>
       <w:tr>
-        <w:tblPrEx>
-          <w:tblCellMar>
-            <w:top w:w="0" w:type="dxa"/>
-            <w:bottom w:w="0" w:type="dxa"/>
-          </w:tblCellMar>
-        </w:tblPrEx>
         <w:tc>
           <w:tcPr>
             <w:tcW w:w="2600" w:type="dxa"/>
@@ -1403,12 +1331,6 @@
         </w:tc>
       </w:tr>
       <w:tr>
-        <w:tblPrEx>
-          <w:tblCellMar>
-            <w:top w:w="0" w:type="dxa"/>
-            <w:bottom w:w="0" w:type="dxa"/>
-          </w:tblCellMar>
-        </w:tblPrEx>
         <w:tc>
           <w:tcPr>
             <w:tcW w:w="2600" w:type="dxa"/>
@@ -1498,12 +1420,6 @@
         </w:tc>
       </w:tr>
       <w:tr>
-        <w:tblPrEx>
-          <w:tblCellMar>
-            <w:top w:w="0" w:type="dxa"/>
-            <w:bottom w:w="0" w:type="dxa"/>
-          </w:tblCellMar>
-        </w:tblPrEx>
         <w:tc>
           <w:tcPr>
             <w:tcW w:w="2600" w:type="dxa"/>
@@ -1593,12 +1509,6 @@
         </w:tc>
       </w:tr>
       <w:tr>
-        <w:tblPrEx>
-          <w:tblCellMar>
-            <w:top w:w="0" w:type="dxa"/>
-            <w:bottom w:w="0" w:type="dxa"/>
-          </w:tblCellMar>
-        </w:tblPrEx>
         <w:tc>
           <w:tcPr>
             <w:tcW w:w="2600" w:type="dxa"/>
@@ -1889,12 +1799,6 @@
         <w:gridCol w:w="2800"/>
       </w:tblGrid>
       <w:tr>
-        <w:tblPrEx>
-          <w:tblCellMar>
-            <w:top w:w="0" w:type="dxa"/>
-            <w:bottom w:w="0" w:type="dxa"/>
-          </w:tblCellMar>
-        </w:tblPrEx>
         <w:trPr>
           <w:tblHeader/>
         </w:trPr>
@@ -1997,12 +1901,6 @@
         </w:tc>
       </w:tr>
       <w:tr>
-        <w:tblPrEx>
-          <w:tblCellMar>
-            <w:top w:w="0" w:type="dxa"/>
-            <w:bottom w:w="0" w:type="dxa"/>
-          </w:tblCellMar>
-        </w:tblPrEx>
         <w:tc>
           <w:tcPr>
             <w:tcW w:w="500" w:type="dxa"/>
@@ -2092,12 +1990,6 @@
         </w:tc>
       </w:tr>
       <w:tr>
-        <w:tblPrEx>
-          <w:tblCellMar>
-            <w:top w:w="0" w:type="dxa"/>
-            <w:bottom w:w="0" w:type="dxa"/>
-          </w:tblCellMar>
-        </w:tblPrEx>
         <w:tc>
           <w:tcPr>
             <w:tcW w:w="500" w:type="dxa"/>
@@ -2187,12 +2079,6 @@
         </w:tc>
       </w:tr>
       <w:tr>
-        <w:tblPrEx>
-          <w:tblCellMar>
-            <w:top w:w="0" w:type="dxa"/>
-            <w:bottom w:w="0" w:type="dxa"/>
-          </w:tblCellMar>
-        </w:tblPrEx>
         <w:tc>
           <w:tcPr>
             <w:tcW w:w="500" w:type="dxa"/>
@@ -2315,7 +2201,7 @@
 </file>
 
 <file path=word/numbering.xml><?xml version="1.0" encoding="utf-8"?>
-<w:numbering xmlns:wpc="http://schemas.microsoft.com/office/word/2010/wordprocessingCanvas" xmlns:cx="http://schemas.microsoft.com/office/drawing/2014/chartex" xmlns:cx1="http://schemas.microsoft.com/office/drawing/2015/9/8/chartex" xmlns:cx2="http://schemas.microsoft.com/office/drawing/2015/10/21/chartex" xmlns:cx3="http://schemas.microsoft.com/office/drawing/2016/5/9/chartex" xmlns:cx4="http://schemas.microsoft.com/office/drawing/2016/5/10/chartex" xmlns:cx5="http://schemas.microsoft.com/office/drawing/2016/5/11/chartex" xmlns:cx6="http://schemas.microsoft.com/office/drawing/2016/5/12/chartex" xmlns:cx7="http://schemas.microsoft.com/office/drawing/2016/5/13/chartex" xmlns:cx8="http://schemas.microsoft.com/office/drawing/2016/5/14/chartex" xmlns:mc="http://schemas.openxmlformats.org/markup-compatibility/2006" xmlns:aink="http://schemas.microsoft.com/office/drawing/2016/ink" xmlns:am3d="http://schemas.microsoft.com/office/drawing/2017/model3d" xmlns:o="urn:schemas-microsoft-com:office:office" xmlns:oel="http://schemas.microsoft.com/office/2019/extlst" xmlns:r="http://schemas.openxmlformats.org/officeDocument/2006/relationships" xmlns:m="http://schemas.openxmlformats.org/officeDocument/2006/math" xmlns:v="urn:schemas-microsoft-com:vml" xmlns:wp14="http://schemas.microsoft.com/office/word/2010/wordprocessingDrawing" xmlns:wp="http://schemas.openxmlformats.org/drawingml/2006/wordprocessingDrawing" xmlns:w10="urn:schemas-microsoft-com:office:word" xmlns:w="http://schemas.openxmlformats.org/wordprocessingml/2006/main" xmlns:w14="http://schemas.microsoft.com/office/word/2010/wordml" xmlns:w15="http://schemas.microsoft.com/office/word/2012/wordml" xmlns:w16cex="http://schemas.microsoft.com/office/word/2018/wordml/cex" xmlns:w16cid="http://schemas.microsoft.com/office/word/2016/wordml/cid" xmlns:w16="http://schemas.microsoft.com/office/word/2018/wordml" xmlns:w16du="http://schemas.microsoft.com/office/word/2023/wordml/word16du" xmlns:w16sdtdh="http://schemas.microsoft.com/office/word/2020/wordml/sdtdatahash" xmlns:w16sdtfl="http://schemas.microsoft.com/office/word/2024/wordml/sdtformatlock" xmlns:w16se="http://schemas.microsoft.com/office/word/2015/wordml/symex" xmlns:wpg="http://schemas.microsoft.com/office/word/2010/wordprocessingGroup" xmlns:wpi="http://schemas.microsoft.com/office/word/2010/wordprocessingInk" xmlns:wne="http://schemas.microsoft.com/office/word/2006/wordml" xmlns:wps="http://schemas.microsoft.com/office/word/2010/wordprocessingShape" mc:Ignorable="w14 w15 w16se w16cid w16 w16cex w16sdtdh w16sdtfl w16du wp14">
+<w:numbering xmlns:wpc="http://schemas.microsoft.com/office/word/2010/wordprocessingCanvas" xmlns:cx="http://schemas.microsoft.com/office/drawing/2014/chartex" xmlns:cx1="http://schemas.microsoft.com/office/drawing/2015/9/8/chartex" xmlns:cx2="http://schemas.microsoft.com/office/drawing/2015/10/21/chartex" xmlns:cx3="http://schemas.microsoft.com/office/drawing/2016/5/9/chartex" xmlns:cx4="http://schemas.microsoft.com/office/drawing/2016/5/10/chartex" xmlns:cx5="http://schemas.microsoft.com/office/drawing/2016/5/11/chartex" xmlns:cx6="http://schemas.microsoft.com/office/drawing/2016/5/12/chartex" xmlns:cx7="http://schemas.microsoft.com/office/drawing/2016/5/13/chartex" xmlns:cx8="http://schemas.microsoft.com/office/drawing/2016/5/14/chartex" xmlns:mc="http://schemas.openxmlformats.org/markup-compatibility/2006" xmlns:aink="http://schemas.microsoft.com/office/drawing/2016/ink" xmlns:am3d="http://schemas.microsoft.com/office/drawing/2017/model3d" xmlns:o="urn:schemas-microsoft-com:office:office" xmlns:oel="http://schemas.microsoft.com/office/2019/extlst" xmlns:r="http://schemas.openxmlformats.org/officeDocument/2006/relationships" xmlns:m="http://schemas.openxmlformats.org/officeDocument/2006/math" xmlns:v="urn:schemas-microsoft-com:vml" xmlns:wp14="http://schemas.microsoft.com/office/word/2010/wordprocessingDrawing" xmlns:wp="http://schemas.openxmlformats.org/drawingml/2006/wordprocessingDrawing" xmlns:w10="urn:schemas-microsoft-com:office:word" xmlns:w="http://schemas.openxmlformats.org/wordprocessingml/2006/main" xmlns:w14="http://schemas.microsoft.com/office/word/2010/wordml" xmlns:w15="http://schemas.microsoft.com/office/word/2012/wordml" xmlns:w16cei="http://schemas.microsoft.com/office/word/2026/wordml/cei" xmlns:w16cex="http://schemas.microsoft.com/office/word/2018/wordml/cex" xmlns:w16cid="http://schemas.microsoft.com/office/word/2016/wordml/cid" xmlns:w16="http://schemas.microsoft.com/office/word/2018/wordml" xmlns:w16du="http://schemas.microsoft.com/office/word/2023/wordml/word16du" xmlns:w16sdtdh="http://schemas.microsoft.com/office/word/2020/wordml/sdtdatahash" xmlns:w16sdtfl="http://schemas.microsoft.com/office/word/2024/wordml/sdtformatlock" xmlns:w16se="http://schemas.microsoft.com/office/word/2015/wordml/symex" xmlns:wpg="http://schemas.microsoft.com/office/word/2010/wordprocessingGroup" xmlns:wpi="http://schemas.microsoft.com/office/word/2010/wordprocessingInk" xmlns:wne="http://schemas.microsoft.com/office/word/2006/wordml" xmlns:wps="http://schemas.microsoft.com/office/word/2010/wordprocessingShape" mc:Ignorable="w14 w15 w16se w16cid w16 w16cex w16sdtdh w16sdtfl w16du wp14">
   <w:abstractNum w:abstractNumId="0" w15:restartNumberingAfterBreak="0">
     <w:nsid w:val="33B730D0"/>
     <w:multiLevelType w:val="hybridMultilevel"/>

</xml_diff>